<commit_message>
Update CA2-Business Information Systems- 2024225.docx
</commit_message>
<xml_diff>
--- a/CA2-Business Information Systems- 2024225.docx
+++ b/CA2-Business Information Systems- 2024225.docx
@@ -1422,6 +1422,12 @@
       <w:r>
         <w:br/>
       </w:r>
+      <w:r>
+        <w:br/>
+      </w:r>
+      <w:r>
+        <w:br/>
+      </w:r>
     </w:p>
     <w:p/>
     <w:p/>
@@ -1511,8 +1517,68 @@
         <w:rPr>
           <w:rStyle w:val="Heading1Char"/>
         </w:rPr>
-        <w:t>Legal Issues</w:t>
-      </w:r>
+        <w:t>Legal Aspects</w:t>
+      </w:r>
+      <w:r>
+        <w:rPr>
+          <w:rStyle w:val="Heading1Char"/>
+        </w:rPr>
+        <w:br/>
+      </w:r>
+      <w:r>
+        <w:t>The system must fulfil with protection laws of data such as :</w:t>
+      </w:r>
+    </w:p>
+    <w:p>
+      <w:r>
+        <w:t>GPDR</w:t>
+      </w:r>
+    </w:p>
+    <w:p>
+      <w:r>
+        <w:t>This means :</w:t>
+      </w:r>
+    </w:p>
+    <w:p>
+      <w:r>
+        <w:t xml:space="preserve">Ask user </w:t>
+      </w:r>
+      <w:r>
+        <w:t>consent</w:t>
+      </w:r>
+    </w:p>
+    <w:p>
+      <w:r>
+        <w:t>Protect personal data</w:t>
+      </w:r>
+    </w:p>
+    <w:p>
+      <w:r>
+        <w:t xml:space="preserve">Allow the user delete their information </w:t>
+      </w:r>
+    </w:p>
+    <w:p>
+      <w:pPr>
+        <w:rPr>
+          <w:rStyle w:val="Heading1Char"/>
+        </w:rPr>
+      </w:pPr>
+      <w:r>
+        <w:t xml:space="preserve">The </w:t>
+      </w:r>
+      <w:r>
+        <w:t>non-compliance</w:t>
+      </w:r>
+      <w:r>
+        <w:t xml:space="preserve"> could cause legal fines </w:t>
+      </w:r>
+    </w:p>
+    <w:p>
+      <w:pPr>
+        <w:rPr>
+          <w:rStyle w:val="Heading1Char"/>
+        </w:rPr>
+      </w:pPr>
       <w:r>
         <w:br/>
       </w:r>
@@ -1526,18 +1592,151 @@
         <w:t>Ethical Issues</w:t>
       </w:r>
       <w:r>
-        <w:br/>
-      </w:r>
-      <w:r>
-        <w:br/>
-      </w:r>
-      <w:r>
-        <w:rPr>
-          <w:rStyle w:val="Heading1Char"/>
-        </w:rPr>
+        <w:rPr>
+          <w:rStyle w:val="Heading1Char"/>
+        </w:rPr>
+        <w:br/>
+      </w:r>
+    </w:p>
+    <w:p>
+      <w:pPr>
+        <w:rPr>
+          <w:rStyle w:val="Heading1Char"/>
+        </w:rPr>
+      </w:pPr>
+      <w:r>
+        <w:t>The system  also must considerate ethics topics:</w:t>
+      </w:r>
+    </w:p>
+    <w:p>
+      <w:r>
+        <w:t>Respect the privacy of the user</w:t>
+      </w:r>
+    </w:p>
+    <w:p>
+      <w:r>
+        <w:t xml:space="preserve">Do not use data without </w:t>
+      </w:r>
+      <w:proofErr w:type="spellStart"/>
+      <w:r>
+        <w:t>without</w:t>
+      </w:r>
+      <w:proofErr w:type="spellEnd"/>
+      <w:r>
+        <w:t xml:space="preserve"> permission</w:t>
+      </w:r>
+    </w:p>
+    <w:p>
+      <w:r>
+        <w:t>Do not manipulate the user</w:t>
+      </w:r>
+    </w:p>
+    <w:p>
+      <w:pPr>
+        <w:rPr>
+          <w:rStyle w:val="Heading1Char"/>
+        </w:rPr>
+      </w:pPr>
+      <w:r>
+        <w:t>Transparency with the use of data</w:t>
+      </w:r>
+      <w:r>
+        <w:rPr>
+          <w:rStyle w:val="Heading1Char"/>
+        </w:rPr>
+        <w:br/>
+      </w:r>
+      <w:r>
+        <w:rPr>
+          <w:rStyle w:val="Heading1Char"/>
+        </w:rPr>
+        <w:br/>
+      </w:r>
+      <w:r>
+        <w:rPr>
+          <w:rStyle w:val="Heading1Char"/>
+        </w:rPr>
+        <w:br/>
+      </w:r>
+      <w:r>
+        <w:rPr>
+          <w:rStyle w:val="Heading1Char"/>
+        </w:rPr>
+        <w:br/>
+      </w:r>
+      <w:r>
+        <w:br/>
+      </w:r>
+      <w:r>
+        <w:br/>
+      </w:r>
+    </w:p>
+    <w:p>
+      <w:pPr>
+        <w:rPr>
+          <w:rStyle w:val="Heading1Char"/>
+        </w:rPr>
+      </w:pPr>
+      <w:r>
+        <w:rPr>
+          <w:rStyle w:val="Heading1Char"/>
+        </w:rPr>
+        <w:lastRenderedPageBreak/>
         <w:t>Conclusion</w:t>
       </w:r>
     </w:p>
+    <w:p>
+      <w:r>
+        <w:t>The development of the app for food order can</w:t>
+      </w:r>
+      <w:r>
+        <w:t xml:space="preserve"> improve </w:t>
+      </w:r>
+      <w:proofErr w:type="spellStart"/>
+      <w:r>
+        <w:t>significally</w:t>
+      </w:r>
+      <w:proofErr w:type="spellEnd"/>
+      <w:r>
+        <w:t xml:space="preserve"> the operation of the business</w:t>
+      </w:r>
+    </w:p>
+    <w:p>
+      <w:pPr>
+        <w:rPr>
+          <w:rStyle w:val="Heading1Char"/>
+        </w:rPr>
+      </w:pPr>
+    </w:p>
+    <w:p>
+      <w:pPr>
+        <w:rPr>
+          <w:rStyle w:val="Heading1Char"/>
+        </w:rPr>
+      </w:pPr>
+    </w:p>
+    <w:p>
+      <w:pPr>
+        <w:rPr>
+          <w:rStyle w:val="Heading1Char"/>
+        </w:rPr>
+      </w:pPr>
+    </w:p>
+    <w:p>
+      <w:pPr>
+        <w:rPr>
+          <w:rStyle w:val="Heading1Char"/>
+        </w:rPr>
+      </w:pPr>
+    </w:p>
+    <w:p>
+      <w:pPr>
+        <w:rPr>
+          <w:rStyle w:val="Heading1Char"/>
+        </w:rPr>
+      </w:pPr>
+    </w:p>
+    <w:p/>
     <w:sectPr>
       <w:pgSz w:w="11906" w:h="16838"/>
       <w:pgMar w:top="1440" w:right="1440" w:bottom="1440" w:left="1440" w:header="708" w:footer="708" w:gutter="0"/>
@@ -2853,7 +3052,6 @@
   <w:style w:type="character" w:default="1" w:styleId="DefaultParagraphFont">
     <w:name w:val="Default Paragraph Font"/>
     <w:uiPriority w:val="1"/>
-    <w:semiHidden/>
     <w:unhideWhenUsed/>
   </w:style>
   <w:style w:type="table" w:default="1" w:styleId="TableNormal">

</xml_diff>

<commit_message>
more information in legal aspects
</commit_message>
<xml_diff>
--- a/CA2-Business Information Systems- 2024225.docx
+++ b/CA2-Business Information Systems- 2024225.docx
@@ -1051,10 +1051,67 @@
       </w:r>
     </w:p>
     <w:p>
-      <w:r>
-        <w:rPr>
-          <w:rStyle w:val="Heading1Char"/>
-        </w:rPr>
+      <w:pPr>
+        <w:rPr>
+          <w:rStyle w:val="Heading1Char"/>
+        </w:rPr>
+      </w:pPr>
+    </w:p>
+    <w:p>
+      <w:pPr>
+        <w:rPr>
+          <w:rStyle w:val="Heading1Char"/>
+        </w:rPr>
+      </w:pPr>
+    </w:p>
+    <w:p>
+      <w:pPr>
+        <w:rPr>
+          <w:rStyle w:val="Heading1Char"/>
+        </w:rPr>
+      </w:pPr>
+    </w:p>
+    <w:p>
+      <w:pPr>
+        <w:rPr>
+          <w:rStyle w:val="Heading1Char"/>
+        </w:rPr>
+      </w:pPr>
+    </w:p>
+    <w:p>
+      <w:pPr>
+        <w:rPr>
+          <w:rStyle w:val="Heading1Char"/>
+        </w:rPr>
+      </w:pPr>
+    </w:p>
+    <w:p>
+      <w:pPr>
+        <w:rPr>
+          <w:rStyle w:val="Heading1Char"/>
+        </w:rPr>
+      </w:pPr>
+    </w:p>
+    <w:p>
+      <w:pPr>
+        <w:rPr>
+          <w:rStyle w:val="Heading1Char"/>
+        </w:rPr>
+      </w:pPr>
+    </w:p>
+    <w:p>
+      <w:pPr>
+        <w:rPr>
+          <w:rStyle w:val="Heading1Char"/>
+        </w:rPr>
+      </w:pPr>
+    </w:p>
+    <w:p>
+      <w:r>
+        <w:rPr>
+          <w:rStyle w:val="Heading1Char"/>
+        </w:rPr>
+        <w:lastRenderedPageBreak/>
         <w:t>Proposed Information System</w:t>
       </w:r>
     </w:p>
@@ -1168,7 +1225,6 @@
         </w:numPr>
       </w:pPr>
       <w:r>
-        <w:lastRenderedPageBreak/>
         <w:t>Business dashboard</w:t>
       </w:r>
     </w:p>
@@ -1217,6 +1273,27 @@
       <w:r>
         <w:t>This system will improve the efficiency and customer experience</w:t>
       </w:r>
+      <w:r>
+        <w:br/>
+      </w:r>
+      <w:r>
+        <w:br/>
+        <w:t>Besides, this system will allow reduce human error, since the orders will be manged automatically . This will help to improve the precision of orders and reduce waiting times.</w:t>
+      </w:r>
+      <w:r>
+        <w:br/>
+      </w:r>
+      <w:r>
+        <w:br/>
+        <w:t>Another positive point , is the system can integrate other tools , such a payment systems, maps for deliveries and data base. All this make the system will be more complete and usable for the business.</w:t>
+      </w:r>
+      <w:r>
+        <w:br/>
+      </w:r>
+      <w:r>
+        <w:br/>
+        <w:t xml:space="preserve">Also cans considerate the implementation of a recommendation system, where the application suggest to the costumer products based in their previous purchases. This can increase the sales and improve the user experience. </w:t>
+      </w:r>
     </w:p>
     <w:p/>
     <w:p/>
@@ -1227,6 +1304,7 @@
         </w:rPr>
       </w:pPr>
       <w:r>
+        <w:lastRenderedPageBreak/>
         <w:br/>
       </w:r>
       <w:r>
@@ -1242,6 +1320,86 @@
       </w:r>
       <w:r>
         <w:t xml:space="preserve"> but the better one for this specific project is  Agile(Scrum).</w:t>
+      </w:r>
+      <w:r>
+        <w:br/>
+      </w:r>
+      <w:r>
+        <w:br/>
+        <w:t xml:space="preserve">Other methodologies </w:t>
+      </w:r>
+      <w:r>
+        <w:t>that</w:t>
+      </w:r>
+      <w:r>
+        <w:t xml:space="preserve"> can be used is Waterfall.</w:t>
+      </w:r>
+      <w:r>
+        <w:br/>
+        <w:t xml:space="preserve">Waterfall is a </w:t>
+      </w:r>
+      <w:r>
+        <w:t xml:space="preserve">traditional </w:t>
+      </w:r>
+      <w:r>
+        <w:t xml:space="preserve">approach where the development is make in </w:t>
+      </w:r>
+      <w:r>
+        <w:t>sequential</w:t>
+      </w:r>
+      <w:r>
+        <w:t xml:space="preserve"> stage. Each stage must complete before to pass to next stage.</w:t>
+      </w:r>
+      <w:r>
+        <w:br/>
+        <w:t xml:space="preserve">These stages include </w:t>
+      </w:r>
+      <w:r>
+        <w:t>analysis</w:t>
+      </w:r>
+      <w:r>
+        <w:t xml:space="preserve">, design, development, testing and implementation </w:t>
+      </w:r>
+      <w:r>
+        <w:br/>
+        <w:t>Othe</w:t>
+      </w:r>
+      <w:r>
+        <w:t>r</w:t>
+      </w:r>
+      <w:r>
+        <w:t xml:space="preserve"> adva</w:t>
+      </w:r>
+      <w:r>
+        <w:t>nta</w:t>
+      </w:r>
+      <w:r>
+        <w:t xml:space="preserve">ges the waterfall is that has clear structure and is easy to understand. However has </w:t>
+      </w:r>
+      <w:r>
+        <w:t>disadvantage</w:t>
+      </w:r>
+      <w:r>
+        <w:t xml:space="preserve"> that don’t allow </w:t>
+      </w:r>
+      <w:r>
+        <w:t>changes</w:t>
+      </w:r>
+      <w:r>
+        <w:t xml:space="preserve"> easily once the project has started.</w:t>
+      </w:r>
+      <w:r>
+        <w:br/>
+      </w:r>
+      <w:r>
+        <w:br/>
+        <w:t xml:space="preserve">Comparing both methodologies, Agile is the more </w:t>
+      </w:r>
+      <w:r>
+        <w:t>suitable to this project because allow to adapt to changes and improve the system continuously according the needs of the user.</w:t>
+      </w:r>
+      <w:r>
+        <w:br/>
       </w:r>
     </w:p>
     <w:p>
@@ -1311,22 +1469,59 @@
       <w:r>
         <w:br/>
       </w:r>
-      <w:r>
-        <w:rPr>
-          <w:rStyle w:val="Heading1Char"/>
-        </w:rPr>
+    </w:p>
+    <w:p>
+      <w:pPr>
+        <w:rPr>
+          <w:rStyle w:val="Heading1Char"/>
+        </w:rPr>
+      </w:pPr>
+    </w:p>
+    <w:p>
+      <w:pPr>
+        <w:rPr>
+          <w:rStyle w:val="Heading1Char"/>
+        </w:rPr>
+      </w:pPr>
+    </w:p>
+    <w:p>
+      <w:pPr>
+        <w:rPr>
+          <w:rStyle w:val="Heading1Char"/>
+        </w:rPr>
+      </w:pPr>
+    </w:p>
+    <w:p>
+      <w:pPr>
+        <w:rPr>
+          <w:rStyle w:val="Heading1Char"/>
+        </w:rPr>
+      </w:pPr>
+    </w:p>
+    <w:p>
+      <w:pPr>
+        <w:rPr>
+          <w:rStyle w:val="Heading1Char"/>
+        </w:rPr>
+      </w:pPr>
+      <w:r>
+        <w:rPr>
+          <w:rStyle w:val="Heading1Char"/>
+        </w:rPr>
+        <w:lastRenderedPageBreak/>
         <w:t>Security, Reliability, Scalability</w:t>
       </w:r>
     </w:p>
     <w:p>
       <w:pPr>
-        <w:rPr>
-          <w:rStyle w:val="Heading1Char"/>
-        </w:rPr>
-      </w:pPr>
-      <w:r>
-        <w:rPr>
-          <w:rStyle w:val="Heading1Char"/>
+        <w:pStyle w:val="Subtitle"/>
+        <w:rPr>
+          <w:rStyle w:val="Strong"/>
+        </w:rPr>
+      </w:pPr>
+      <w:r>
+        <w:rPr>
+          <w:rStyle w:val="Strong"/>
         </w:rPr>
         <w:t>Security</w:t>
       </w:r>
@@ -1337,93 +1532,239 @@
       </w:r>
     </w:p>
     <w:p>
+      <w:pPr>
+        <w:pStyle w:val="ListParagraph"/>
+        <w:numPr>
+          <w:ilvl w:val="0"/>
+          <w:numId w:val="8"/>
+        </w:numPr>
+        <w:spacing w:after="0"/>
+      </w:pPr>
       <w:r>
         <w:t>Encrypted passwords</w:t>
       </w:r>
-      <w:r>
-        <w:br/>
+    </w:p>
+    <w:p>
+      <w:pPr>
+        <w:pStyle w:val="ListParagraph"/>
+        <w:numPr>
+          <w:ilvl w:val="0"/>
+          <w:numId w:val="8"/>
+        </w:numPr>
+        <w:spacing w:after="0"/>
+      </w:pPr>
+      <w:r>
         <w:t>Use of HTTPS</w:t>
       </w:r>
     </w:p>
     <w:p>
+      <w:pPr>
+        <w:pStyle w:val="ListParagraph"/>
+        <w:numPr>
+          <w:ilvl w:val="0"/>
+          <w:numId w:val="8"/>
+        </w:numPr>
+        <w:spacing w:after="0"/>
+      </w:pPr>
       <w:r>
         <w:t>Access control (admin and user)</w:t>
       </w:r>
     </w:p>
     <w:p>
+      <w:pPr>
+        <w:pStyle w:val="ListParagraph"/>
+        <w:numPr>
+          <w:ilvl w:val="0"/>
+          <w:numId w:val="8"/>
+        </w:numPr>
+        <w:spacing w:after="0"/>
+      </w:pPr>
       <w:r>
         <w:t>Protection against attacks</w:t>
       </w:r>
     </w:p>
     <w:p>
+      <w:pPr>
+        <w:spacing w:after="0"/>
+      </w:pPr>
+      <w:r>
+        <w:t>These avoid the theft of data and protect the privacy</w:t>
+      </w:r>
+      <w:r>
+        <w:br/>
+      </w:r>
+      <w:r>
+        <w:br/>
+        <w:t xml:space="preserve">Besides , is important implement a safe </w:t>
+      </w:r>
+      <w:r>
+        <w:t>authentication, such a verification in two steps, to increase the user account  protection . Also must apply security</w:t>
+      </w:r>
+    </w:p>
+    <w:p>
+      <w:pPr>
+        <w:spacing w:after="0"/>
+      </w:pPr>
+      <w:r>
+        <w:t xml:space="preserve">policies to avoid </w:t>
+      </w:r>
+      <w:r>
+        <w:t>unauthorized</w:t>
+      </w:r>
+      <w:r>
+        <w:t xml:space="preserve"> access </w:t>
+      </w:r>
+      <w:r>
+        <w:br/>
+      </w:r>
+      <w:r>
+        <w:br/>
+        <w:t>The system must fulfil with modern security standards and make periodic testing to detect possible vulnerabilities . This help to keep the user trust in the application.</w:t>
+      </w:r>
+    </w:p>
+    <w:p/>
+    <w:p>
+      <w:pPr>
+        <w:pStyle w:val="Subtitle"/>
+        <w:rPr>
+          <w:rStyle w:val="Heading1Char"/>
+          <w:rFonts w:asciiTheme="minorHAnsi" w:hAnsiTheme="minorHAnsi"/>
+          <w:color w:val="595959" w:themeColor="text1" w:themeTint="A6"/>
+          <w:sz w:val="28"/>
+          <w:szCs w:val="28"/>
+        </w:rPr>
+      </w:pPr>
+      <w:r>
+        <w:rPr>
+          <w:rStyle w:val="Heading1Char"/>
+          <w:rFonts w:asciiTheme="minorHAnsi" w:hAnsiTheme="minorHAnsi"/>
+          <w:color w:val="595959" w:themeColor="text1" w:themeTint="A6"/>
+          <w:sz w:val="28"/>
+          <w:szCs w:val="28"/>
+        </w:rPr>
+        <w:t>Reliability</w:t>
+      </w:r>
+    </w:p>
+    <w:p>
+      <w:r>
+        <w:t xml:space="preserve">Also is important count with </w:t>
+      </w:r>
+      <w:r>
+        <w:t>reliable servers</w:t>
+      </w:r>
+      <w:r>
+        <w:t xml:space="preserve"> that guarantee the system be available in any time. In case of fails, the system must have mechanism of fast recovery .</w:t>
+      </w:r>
+      <w:r>
+        <w:br/>
+        <w:t xml:space="preserve">The realization of testing before launch the system is the key to identify errors. </w:t>
+      </w:r>
+    </w:p>
+    <w:p>
+      <w:r>
+        <w:t xml:space="preserve">Besides, can make </w:t>
+      </w:r>
+      <w:r>
+        <w:t>continuous</w:t>
+      </w:r>
+      <w:r>
+        <w:t xml:space="preserve"> test to ensure the application </w:t>
+      </w:r>
+      <w:r>
+        <w:t>work correctly after each update</w:t>
+      </w:r>
+      <w:r>
+        <w:br/>
+      </w:r>
+      <w:r>
+        <w:br/>
+        <w:t>Measure to take</w:t>
+      </w:r>
+    </w:p>
+    <w:p>
+      <w:pPr>
+        <w:pStyle w:val="ListParagraph"/>
+        <w:numPr>
+          <w:ilvl w:val="0"/>
+          <w:numId w:val="10"/>
+        </w:numPr>
+      </w:pPr>
+      <w:r>
+        <w:t>Automatic backups</w:t>
+      </w:r>
+    </w:p>
+    <w:p>
+      <w:pPr>
+        <w:pStyle w:val="ListParagraph"/>
+        <w:numPr>
+          <w:ilvl w:val="0"/>
+          <w:numId w:val="10"/>
+        </w:numPr>
+      </w:pPr>
+      <w:r>
+        <w:t>System Testing</w:t>
+      </w:r>
+    </w:p>
+    <w:p>
+      <w:pPr>
+        <w:pStyle w:val="ListParagraph"/>
+        <w:numPr>
+          <w:ilvl w:val="0"/>
+          <w:numId w:val="10"/>
+        </w:numPr>
+      </w:pPr>
+      <w:r>
+        <w:t>Constant monitoring</w:t>
+      </w:r>
+    </w:p>
+    <w:p>
+      <w:r>
+        <w:t>This ensure that the system don’t suffer fails</w:t>
+      </w:r>
+    </w:p>
+    <w:p>
+      <w:pPr>
+        <w:pStyle w:val="Subtitle"/>
+        <w:rPr>
+          <w:rStyle w:val="Heading1Char"/>
+          <w:rFonts w:asciiTheme="minorHAnsi" w:hAnsiTheme="minorHAnsi"/>
+          <w:color w:val="595959" w:themeColor="text1" w:themeTint="A6"/>
+          <w:sz w:val="28"/>
+          <w:szCs w:val="28"/>
+        </w:rPr>
+      </w:pPr>
+      <w:r>
+        <w:br/>
+      </w:r>
+      <w:r>
+        <w:rPr>
+          <w:rStyle w:val="Heading1Char"/>
+          <w:rFonts w:asciiTheme="minorHAnsi" w:hAnsiTheme="minorHAnsi"/>
+          <w:color w:val="595959" w:themeColor="text1" w:themeTint="A6"/>
+          <w:sz w:val="28"/>
+          <w:szCs w:val="28"/>
+        </w:rPr>
+        <w:t>Scalability</w:t>
+      </w:r>
+    </w:p>
+    <w:p>
+      <w:r>
+        <w:t>For example, if the business growth and receive more orders, the system must be able to manage this increase of orders without loose performance. The use of services in the cloud allow increase the resources the dynamic way according the demand.</w:t>
+      </w:r>
+      <w:r>
+        <w:br/>
+        <w:t xml:space="preserve">Also can use  microservices to divide the app in smaller parts, which facilitates its </w:t>
+      </w:r>
       <w:r>
         <w:lastRenderedPageBreak/>
-        <w:t>These avoid the theft of data and protect the privacy</w:t>
-      </w:r>
-    </w:p>
-    <w:p/>
-    <w:p>
-      <w:pPr>
-        <w:rPr>
-          <w:rStyle w:val="Heading1Char"/>
-        </w:rPr>
-      </w:pPr>
-      <w:r>
-        <w:rPr>
-          <w:rStyle w:val="Heading1Char"/>
-        </w:rPr>
-        <w:t>Reliability</w:t>
-      </w:r>
-    </w:p>
-    <w:p>
-      <w:r>
-        <w:t xml:space="preserve">The system must work correctly in any time </w:t>
-      </w:r>
-      <w:r>
-        <w:br/>
-      </w:r>
-      <w:r>
-        <w:br/>
-        <w:t>Measure to take</w:t>
-      </w:r>
-      <w:r>
-        <w:br/>
-        <w:t>Automatic backups</w:t>
-      </w:r>
-      <w:r>
-        <w:br/>
-        <w:t>System Testing</w:t>
-      </w:r>
-    </w:p>
-    <w:p>
-      <w:r>
-        <w:t>Constant monitoring</w:t>
-      </w:r>
-      <w:r>
-        <w:br/>
-      </w:r>
-      <w:r>
-        <w:br/>
-        <w:t>This ensure that the system don’t suffer fails</w:t>
-      </w:r>
-    </w:p>
-    <w:p>
-      <w:pPr>
-        <w:rPr>
-          <w:rStyle w:val="Heading1Char"/>
-        </w:rPr>
-      </w:pPr>
-      <w:r>
-        <w:br/>
-      </w:r>
-      <w:r>
-        <w:rPr>
-          <w:rStyle w:val="Heading1Char"/>
-        </w:rPr>
-        <w:t>Scalability</w:t>
-      </w:r>
-    </w:p>
-    <w:p>
+        <w:t>maintenance and scalability</w:t>
+      </w:r>
+      <w:r>
+        <w:br/>
+      </w:r>
+      <w:r>
+        <w:br/>
+      </w:r>
       <w:r>
         <w:t>The system must</w:t>
       </w:r>
@@ -1433,16 +1774,39 @@
       <w:r>
         <w:br/>
       </w:r>
-      <w:r>
-        <w:br/>
+    </w:p>
+    <w:p>
+      <w:pPr>
+        <w:pStyle w:val="ListParagraph"/>
+        <w:numPr>
+          <w:ilvl w:val="0"/>
+          <w:numId w:val="11"/>
+        </w:numPr>
+      </w:pPr>
+      <w:r>
         <w:t xml:space="preserve">use of cloud service in the cloud </w:t>
       </w:r>
-      <w:r>
-        <w:br/>
+    </w:p>
+    <w:p>
+      <w:pPr>
+        <w:pStyle w:val="ListParagraph"/>
+        <w:numPr>
+          <w:ilvl w:val="0"/>
+          <w:numId w:val="11"/>
+        </w:numPr>
+      </w:pPr>
+      <w:r>
         <w:t xml:space="preserve">scalable data base </w:t>
       </w:r>
     </w:p>
     <w:p>
+      <w:pPr>
+        <w:pStyle w:val="ListParagraph"/>
+        <w:numPr>
+          <w:ilvl w:val="0"/>
+          <w:numId w:val="11"/>
+        </w:numPr>
+      </w:pPr>
       <w:r>
         <w:t>load balancing</w:t>
       </w:r>
@@ -1468,102 +1832,111 @@
         <w:br/>
       </w:r>
     </w:p>
-    <w:p/>
-    <w:p/>
-    <w:p>
-      <w:pPr>
-        <w:rPr>
-          <w:rStyle w:val="Heading1Char"/>
-        </w:rPr>
-      </w:pPr>
-    </w:p>
-    <w:p>
-      <w:pPr>
-        <w:rPr>
-          <w:rStyle w:val="Heading1Char"/>
-        </w:rPr>
-      </w:pPr>
-    </w:p>
-    <w:p>
-      <w:pPr>
-        <w:rPr>
-          <w:rStyle w:val="Heading1Char"/>
-        </w:rPr>
-      </w:pPr>
-    </w:p>
-    <w:p>
-      <w:pPr>
-        <w:rPr>
-          <w:rStyle w:val="Heading1Char"/>
-        </w:rPr>
-      </w:pPr>
-    </w:p>
-    <w:p>
-      <w:pPr>
-        <w:rPr>
-          <w:rStyle w:val="Heading1Char"/>
-        </w:rPr>
-      </w:pPr>
-    </w:p>
-    <w:p>
-      <w:pPr>
-        <w:rPr>
-          <w:rStyle w:val="Heading1Char"/>
-        </w:rPr>
-      </w:pPr>
-    </w:p>
-    <w:p>
-      <w:pPr>
-        <w:rPr>
-          <w:rStyle w:val="Heading1Char"/>
-        </w:rPr>
-      </w:pPr>
-    </w:p>
-    <w:p>
-      <w:pPr>
-        <w:rPr>
-          <w:rStyle w:val="Heading1Char"/>
-        </w:rPr>
-      </w:pPr>
-    </w:p>
-    <w:p>
-      <w:pPr>
-        <w:rPr>
-          <w:rStyle w:val="Heading1Char"/>
-        </w:rPr>
-      </w:pPr>
-    </w:p>
-    <w:p>
-      <w:pPr>
-        <w:rPr>
-          <w:rStyle w:val="Heading1Char"/>
-        </w:rPr>
-      </w:pPr>
-    </w:p>
-    <w:p>
-      <w:pPr>
-        <w:rPr>
-          <w:rStyle w:val="Heading1Char"/>
-        </w:rPr>
-      </w:pPr>
-    </w:p>
-    <w:p/>
-    <w:p>
-      <w:r>
-        <w:br/>
-      </w:r>
-      <w:r>
-        <w:rPr>
-          <w:rStyle w:val="Heading1Char"/>
-        </w:rPr>
+    <w:p>
+      <w:pPr>
+        <w:pStyle w:val="ListParagraph"/>
+      </w:pPr>
+    </w:p>
+    <w:p>
+      <w:pPr>
+        <w:pStyle w:val="ListParagraph"/>
+        <w:rPr>
+          <w:rStyle w:val="Heading1Char"/>
+        </w:rPr>
+      </w:pPr>
+    </w:p>
+    <w:p>
+      <w:pPr>
+        <w:rPr>
+          <w:rStyle w:val="Heading1Char"/>
+        </w:rPr>
+      </w:pPr>
+    </w:p>
+    <w:p>
+      <w:pPr>
+        <w:rPr>
+          <w:rStyle w:val="Heading1Char"/>
+        </w:rPr>
+      </w:pPr>
+    </w:p>
+    <w:p>
+      <w:pPr>
+        <w:rPr>
+          <w:rStyle w:val="Heading1Char"/>
+        </w:rPr>
+      </w:pPr>
+    </w:p>
+    <w:p>
+      <w:pPr>
+        <w:rPr>
+          <w:rStyle w:val="Heading1Char"/>
+        </w:rPr>
+      </w:pPr>
+    </w:p>
+    <w:p>
+      <w:pPr>
+        <w:rPr>
+          <w:rStyle w:val="Heading1Char"/>
+        </w:rPr>
+      </w:pPr>
+    </w:p>
+    <w:p>
+      <w:pPr>
+        <w:rPr>
+          <w:rStyle w:val="Heading1Char"/>
+        </w:rPr>
+      </w:pPr>
+    </w:p>
+    <w:p>
+      <w:pPr>
+        <w:rPr>
+          <w:rStyle w:val="Heading1Char"/>
+        </w:rPr>
+      </w:pPr>
+    </w:p>
+    <w:p>
+      <w:pPr>
+        <w:rPr>
+          <w:rStyle w:val="Heading1Char"/>
+        </w:rPr>
+      </w:pPr>
+    </w:p>
+    <w:p>
+      <w:pPr>
+        <w:rPr>
+          <w:rStyle w:val="Heading1Char"/>
+        </w:rPr>
+      </w:pPr>
+    </w:p>
+    <w:p>
+      <w:pPr>
+        <w:rPr>
+          <w:rStyle w:val="Heading1Char"/>
+        </w:rPr>
+      </w:pPr>
+    </w:p>
+    <w:p>
+      <w:pPr>
+        <w:rPr>
+          <w:rStyle w:val="Heading1Char"/>
+        </w:rPr>
+      </w:pPr>
+    </w:p>
+    <w:p>
+      <w:pPr>
+        <w:rPr>
+          <w:rStyle w:val="Heading1Char"/>
+        </w:rPr>
+      </w:pPr>
+      <w:r>
+        <w:rPr>
+          <w:rStyle w:val="Heading1Char"/>
+        </w:rPr>
+        <w:lastRenderedPageBreak/>
         <w:t>Legal Aspects</w:t>
       </w:r>
-      <w:r>
-        <w:rPr>
-          <w:rStyle w:val="Heading1Char"/>
-        </w:rPr>
-        <w:br/>
-      </w:r>
+    </w:p>
+    <w:p>
       <w:r>
         <w:t>The system must fulfil with protection laws of data such as :</w:t>
       </w:r>
@@ -1575,10 +1948,17 @@
     </w:p>
     <w:p>
       <w:r>
-        <w:t>This means :</w:t>
-      </w:r>
-    </w:p>
-    <w:p>
+        <w:t>This means:</w:t>
+      </w:r>
+    </w:p>
+    <w:p>
+      <w:pPr>
+        <w:pStyle w:val="ListParagraph"/>
+        <w:numPr>
+          <w:ilvl w:val="0"/>
+          <w:numId w:val="12"/>
+        </w:numPr>
+      </w:pPr>
       <w:r>
         <w:t xml:space="preserve">Ask user </w:t>
       </w:r>
@@ -1587,21 +1967,30 @@
       </w:r>
     </w:p>
     <w:p>
+      <w:pPr>
+        <w:pStyle w:val="ListParagraph"/>
+        <w:numPr>
+          <w:ilvl w:val="0"/>
+          <w:numId w:val="12"/>
+        </w:numPr>
+      </w:pPr>
       <w:r>
         <w:t>Protect personal data</w:t>
       </w:r>
     </w:p>
     <w:p>
+      <w:pPr>
+        <w:pStyle w:val="ListParagraph"/>
+        <w:numPr>
+          <w:ilvl w:val="0"/>
+          <w:numId w:val="12"/>
+        </w:numPr>
+      </w:pPr>
       <w:r>
         <w:t xml:space="preserve">Allow the user delete their information </w:t>
       </w:r>
     </w:p>
     <w:p>
-      <w:pPr>
-        <w:rPr>
-          <w:rStyle w:val="Heading1Char"/>
-        </w:rPr>
-      </w:pPr>
       <w:r>
         <w:t xml:space="preserve">The </w:t>
       </w:r>
@@ -1611,23 +2000,116 @@
       <w:r>
         <w:t xml:space="preserve"> could cause legal fines </w:t>
       </w:r>
-    </w:p>
-    <w:p>
-      <w:pPr>
-        <w:rPr>
-          <w:rStyle w:val="Heading1Char"/>
-        </w:rPr>
-      </w:pPr>
-      <w:r>
-        <w:br/>
-      </w:r>
-      <w:r>
-        <w:br/>
-      </w:r>
-      <w:r>
-        <w:rPr>
-          <w:rStyle w:val="Heading1Char"/>
-        </w:rPr>
+      <w:r>
+        <w:br/>
+      </w:r>
+      <w:r>
+        <w:br/>
+        <w:t xml:space="preserve">In Addition to </w:t>
+      </w:r>
+      <w:r>
+        <w:t>GPDR</w:t>
+      </w:r>
+      <w:r>
+        <w:t>, the system must fulfil with other regulations related with e commerce and online payments. For example, is important ensure that the transactions be safe and the financial data be protected.</w:t>
+      </w:r>
+      <w:r>
+        <w:br/>
+      </w:r>
+      <w:r>
+        <w:br/>
+        <w:t xml:space="preserve">The business must inform clearly </w:t>
+      </w:r>
+      <w:r>
+        <w:t xml:space="preserve">to the user about how their data is used </w:t>
+      </w:r>
+      <w:r>
+        <w:t>through</w:t>
+      </w:r>
+      <w:r>
+        <w:t xml:space="preserve"> privacy policies. These policies must be easy to understand and accessible for all users.</w:t>
+      </w:r>
+    </w:p>
+    <w:p>
+      <w:pPr>
+        <w:rPr>
+          <w:rStyle w:val="Heading1Char"/>
+        </w:rPr>
+      </w:pPr>
+    </w:p>
+    <w:p>
+      <w:pPr>
+        <w:rPr>
+          <w:rStyle w:val="Heading1Char"/>
+        </w:rPr>
+      </w:pPr>
+      <w:r>
+        <w:br/>
+      </w:r>
+      <w:r>
+        <w:br/>
+      </w:r>
+    </w:p>
+    <w:p>
+      <w:pPr>
+        <w:rPr>
+          <w:rStyle w:val="Heading1Char"/>
+        </w:rPr>
+      </w:pPr>
+    </w:p>
+    <w:p>
+      <w:pPr>
+        <w:rPr>
+          <w:rStyle w:val="Heading1Char"/>
+        </w:rPr>
+      </w:pPr>
+    </w:p>
+    <w:p>
+      <w:pPr>
+        <w:rPr>
+          <w:rStyle w:val="Heading1Char"/>
+        </w:rPr>
+      </w:pPr>
+    </w:p>
+    <w:p>
+      <w:pPr>
+        <w:rPr>
+          <w:rStyle w:val="Heading1Char"/>
+        </w:rPr>
+      </w:pPr>
+    </w:p>
+    <w:p>
+      <w:pPr>
+        <w:rPr>
+          <w:rStyle w:val="Heading1Char"/>
+        </w:rPr>
+      </w:pPr>
+    </w:p>
+    <w:p>
+      <w:pPr>
+        <w:rPr>
+          <w:rStyle w:val="Heading1Char"/>
+        </w:rPr>
+      </w:pPr>
+    </w:p>
+    <w:p>
+      <w:pPr>
+        <w:rPr>
+          <w:rStyle w:val="Heading1Char"/>
+        </w:rPr>
+      </w:pPr>
+    </w:p>
+    <w:p>
+      <w:pPr>
+        <w:rPr>
+          <w:rStyle w:val="Heading1Char"/>
+        </w:rPr>
+      </w:pPr>
+      <w:r>
+        <w:rPr>
+          <w:rStyle w:val="Heading1Char"/>
+        </w:rPr>
+        <w:lastRenderedPageBreak/>
         <w:t>Ethical Issues</w:t>
       </w:r>
       <w:r>
@@ -1677,50 +2159,120 @@
         </w:rPr>
       </w:pPr>
       <w:r>
+        <w:t>Transparency with the use of data</w:t>
+      </w:r>
+      <w:r>
+        <w:rPr>
+          <w:rStyle w:val="Heading1Char"/>
+        </w:rPr>
+        <w:br/>
+      </w:r>
+      <w:r>
+        <w:rPr>
+          <w:rStyle w:val="Heading1Char"/>
+        </w:rPr>
+        <w:br/>
+      </w:r>
+      <w:r>
+        <w:rPr>
+          <w:rStyle w:val="Heading1Char"/>
+        </w:rPr>
+        <w:br/>
+      </w:r>
+      <w:r>
+        <w:rPr>
+          <w:rStyle w:val="Heading1Char"/>
+        </w:rPr>
+        <w:br/>
+      </w:r>
+      <w:r>
+        <w:br/>
+      </w:r>
+      <w:r>
+        <w:br/>
+      </w:r>
+    </w:p>
+    <w:p>
+      <w:pPr>
+        <w:rPr>
+          <w:rStyle w:val="Heading1Char"/>
+        </w:rPr>
+      </w:pPr>
+    </w:p>
+    <w:p>
+      <w:pPr>
+        <w:rPr>
+          <w:rStyle w:val="Heading1Char"/>
+        </w:rPr>
+      </w:pPr>
+    </w:p>
+    <w:p>
+      <w:pPr>
+        <w:rPr>
+          <w:rStyle w:val="Heading1Char"/>
+        </w:rPr>
+      </w:pPr>
+    </w:p>
+    <w:p>
+      <w:pPr>
+        <w:rPr>
+          <w:rStyle w:val="Heading1Char"/>
+        </w:rPr>
+      </w:pPr>
+    </w:p>
+    <w:p>
+      <w:pPr>
+        <w:rPr>
+          <w:rStyle w:val="Heading1Char"/>
+        </w:rPr>
+      </w:pPr>
+    </w:p>
+    <w:p>
+      <w:pPr>
+        <w:rPr>
+          <w:rStyle w:val="Heading1Char"/>
+        </w:rPr>
+      </w:pPr>
+    </w:p>
+    <w:p>
+      <w:pPr>
+        <w:rPr>
+          <w:rStyle w:val="Heading1Char"/>
+        </w:rPr>
+      </w:pPr>
+    </w:p>
+    <w:p>
+      <w:pPr>
+        <w:rPr>
+          <w:rStyle w:val="Heading1Char"/>
+        </w:rPr>
+      </w:pPr>
+    </w:p>
+    <w:p>
+      <w:pPr>
+        <w:rPr>
+          <w:rStyle w:val="Heading1Char"/>
+        </w:rPr>
+      </w:pPr>
+    </w:p>
+    <w:p>
+      <w:pPr>
+        <w:rPr>
+          <w:rStyle w:val="Heading1Char"/>
+        </w:rPr>
+      </w:pPr>
+    </w:p>
+    <w:p>
+      <w:pPr>
+        <w:rPr>
+          <w:rStyle w:val="Heading1Char"/>
+        </w:rPr>
+      </w:pPr>
+      <w:r>
+        <w:rPr>
+          <w:rStyle w:val="Heading1Char"/>
+        </w:rPr>
         <w:lastRenderedPageBreak/>
-        <w:t>Transparency with the use of data</w:t>
-      </w:r>
-      <w:r>
-        <w:rPr>
-          <w:rStyle w:val="Heading1Char"/>
-        </w:rPr>
-        <w:br/>
-      </w:r>
-      <w:r>
-        <w:rPr>
-          <w:rStyle w:val="Heading1Char"/>
-        </w:rPr>
-        <w:br/>
-      </w:r>
-      <w:r>
-        <w:rPr>
-          <w:rStyle w:val="Heading1Char"/>
-        </w:rPr>
-        <w:br/>
-      </w:r>
-      <w:r>
-        <w:rPr>
-          <w:rStyle w:val="Heading1Char"/>
-        </w:rPr>
-        <w:br/>
-      </w:r>
-      <w:r>
-        <w:br/>
-      </w:r>
-      <w:r>
-        <w:br/>
-      </w:r>
-    </w:p>
-    <w:p>
-      <w:pPr>
-        <w:rPr>
-          <w:rStyle w:val="Heading1Char"/>
-        </w:rPr>
-      </w:pPr>
-      <w:r>
-        <w:rPr>
-          <w:rStyle w:val="Heading1Char"/>
-        </w:rPr>
         <w:t>Conclusion</w:t>
       </w:r>
     </w:p>
@@ -1914,6 +2466,119 @@
     </w:lvl>
   </w:abstractNum>
   <w:abstractNum w:abstractNumId="1" w15:restartNumberingAfterBreak="0">
+    <w:nsid w:val="09203FBE"/>
+    <w:multiLevelType w:val="hybridMultilevel"/>
+    <w:tmpl w:val="D960C92A"/>
+    <w:lvl w:ilvl="0" w:tplc="08090001">
+      <w:start w:val="1"/>
+      <w:numFmt w:val="bullet"/>
+      <w:lvlText w:val=""/>
+      <w:lvlJc w:val="left"/>
+      <w:pPr>
+        <w:ind w:left="720" w:hanging="360"/>
+      </w:pPr>
+      <w:rPr>
+        <w:rFonts w:ascii="Symbol" w:hAnsi="Symbol" w:hint="default"/>
+      </w:rPr>
+    </w:lvl>
+    <w:lvl w:ilvl="1" w:tplc="08090003" w:tentative="1">
+      <w:start w:val="1"/>
+      <w:numFmt w:val="bullet"/>
+      <w:lvlText w:val="o"/>
+      <w:lvlJc w:val="left"/>
+      <w:pPr>
+        <w:ind w:left="1440" w:hanging="360"/>
+      </w:pPr>
+      <w:rPr>
+        <w:rFonts w:ascii="Courier New" w:hAnsi="Courier New" w:cs="Courier New" w:hint="default"/>
+      </w:rPr>
+    </w:lvl>
+    <w:lvl w:ilvl="2" w:tplc="08090005" w:tentative="1">
+      <w:start w:val="1"/>
+      <w:numFmt w:val="bullet"/>
+      <w:lvlText w:val=""/>
+      <w:lvlJc w:val="left"/>
+      <w:pPr>
+        <w:ind w:left="2160" w:hanging="360"/>
+      </w:pPr>
+      <w:rPr>
+        <w:rFonts w:ascii="Wingdings" w:hAnsi="Wingdings" w:hint="default"/>
+      </w:rPr>
+    </w:lvl>
+    <w:lvl w:ilvl="3" w:tplc="08090001" w:tentative="1">
+      <w:start w:val="1"/>
+      <w:numFmt w:val="bullet"/>
+      <w:lvlText w:val=""/>
+      <w:lvlJc w:val="left"/>
+      <w:pPr>
+        <w:ind w:left="2880" w:hanging="360"/>
+      </w:pPr>
+      <w:rPr>
+        <w:rFonts w:ascii="Symbol" w:hAnsi="Symbol" w:hint="default"/>
+      </w:rPr>
+    </w:lvl>
+    <w:lvl w:ilvl="4" w:tplc="08090003" w:tentative="1">
+      <w:start w:val="1"/>
+      <w:numFmt w:val="bullet"/>
+      <w:lvlText w:val="o"/>
+      <w:lvlJc w:val="left"/>
+      <w:pPr>
+        <w:ind w:left="3600" w:hanging="360"/>
+      </w:pPr>
+      <w:rPr>
+        <w:rFonts w:ascii="Courier New" w:hAnsi="Courier New" w:cs="Courier New" w:hint="default"/>
+      </w:rPr>
+    </w:lvl>
+    <w:lvl w:ilvl="5" w:tplc="08090005" w:tentative="1">
+      <w:start w:val="1"/>
+      <w:numFmt w:val="bullet"/>
+      <w:lvlText w:val=""/>
+      <w:lvlJc w:val="left"/>
+      <w:pPr>
+        <w:ind w:left="4320" w:hanging="360"/>
+      </w:pPr>
+      <w:rPr>
+        <w:rFonts w:ascii="Wingdings" w:hAnsi="Wingdings" w:hint="default"/>
+      </w:rPr>
+    </w:lvl>
+    <w:lvl w:ilvl="6" w:tplc="08090001" w:tentative="1">
+      <w:start w:val="1"/>
+      <w:numFmt w:val="bullet"/>
+      <w:lvlText w:val=""/>
+      <w:lvlJc w:val="left"/>
+      <w:pPr>
+        <w:ind w:left="5040" w:hanging="360"/>
+      </w:pPr>
+      <w:rPr>
+        <w:rFonts w:ascii="Symbol" w:hAnsi="Symbol" w:hint="default"/>
+      </w:rPr>
+    </w:lvl>
+    <w:lvl w:ilvl="7" w:tplc="08090003" w:tentative="1">
+      <w:start w:val="1"/>
+      <w:numFmt w:val="bullet"/>
+      <w:lvlText w:val="o"/>
+      <w:lvlJc w:val="left"/>
+      <w:pPr>
+        <w:ind w:left="5760" w:hanging="360"/>
+      </w:pPr>
+      <w:rPr>
+        <w:rFonts w:ascii="Courier New" w:hAnsi="Courier New" w:cs="Courier New" w:hint="default"/>
+      </w:rPr>
+    </w:lvl>
+    <w:lvl w:ilvl="8" w:tplc="08090005" w:tentative="1">
+      <w:start w:val="1"/>
+      <w:numFmt w:val="bullet"/>
+      <w:lvlText w:val=""/>
+      <w:lvlJc w:val="left"/>
+      <w:pPr>
+        <w:ind w:left="6480" w:hanging="360"/>
+      </w:pPr>
+      <w:rPr>
+        <w:rFonts w:ascii="Wingdings" w:hAnsi="Wingdings" w:hint="default"/>
+      </w:rPr>
+    </w:lvl>
+  </w:abstractNum>
+  <w:abstractNum w:abstractNumId="2" w15:restartNumberingAfterBreak="0">
     <w:nsid w:val="15272F23"/>
     <w:multiLevelType w:val="hybridMultilevel"/>
     <w:tmpl w:val="F66AEA02"/>
@@ -2026,7 +2691,7 @@
       </w:rPr>
     </w:lvl>
   </w:abstractNum>
-  <w:abstractNum w:abstractNumId="2" w15:restartNumberingAfterBreak="0">
+  <w:abstractNum w:abstractNumId="3" w15:restartNumberingAfterBreak="0">
     <w:nsid w:val="17943300"/>
     <w:multiLevelType w:val="hybridMultilevel"/>
     <w:tmpl w:val="6D2EDDC2"/>
@@ -2139,7 +2804,120 @@
       </w:rPr>
     </w:lvl>
   </w:abstractNum>
-  <w:abstractNum w:abstractNumId="3" w15:restartNumberingAfterBreak="0">
+  <w:abstractNum w:abstractNumId="4" w15:restartNumberingAfterBreak="0">
+    <w:nsid w:val="20785A24"/>
+    <w:multiLevelType w:val="hybridMultilevel"/>
+    <w:tmpl w:val="BC28EE1C"/>
+    <w:lvl w:ilvl="0" w:tplc="08090001">
+      <w:start w:val="1"/>
+      <w:numFmt w:val="bullet"/>
+      <w:lvlText w:val=""/>
+      <w:lvlJc w:val="left"/>
+      <w:pPr>
+        <w:ind w:left="720" w:hanging="360"/>
+      </w:pPr>
+      <w:rPr>
+        <w:rFonts w:ascii="Symbol" w:hAnsi="Symbol" w:hint="default"/>
+      </w:rPr>
+    </w:lvl>
+    <w:lvl w:ilvl="1" w:tplc="08090003" w:tentative="1">
+      <w:start w:val="1"/>
+      <w:numFmt w:val="bullet"/>
+      <w:lvlText w:val="o"/>
+      <w:lvlJc w:val="left"/>
+      <w:pPr>
+        <w:ind w:left="1440" w:hanging="360"/>
+      </w:pPr>
+      <w:rPr>
+        <w:rFonts w:ascii="Courier New" w:hAnsi="Courier New" w:cs="Courier New" w:hint="default"/>
+      </w:rPr>
+    </w:lvl>
+    <w:lvl w:ilvl="2" w:tplc="08090005" w:tentative="1">
+      <w:start w:val="1"/>
+      <w:numFmt w:val="bullet"/>
+      <w:lvlText w:val=""/>
+      <w:lvlJc w:val="left"/>
+      <w:pPr>
+        <w:ind w:left="2160" w:hanging="360"/>
+      </w:pPr>
+      <w:rPr>
+        <w:rFonts w:ascii="Wingdings" w:hAnsi="Wingdings" w:hint="default"/>
+      </w:rPr>
+    </w:lvl>
+    <w:lvl w:ilvl="3" w:tplc="08090001" w:tentative="1">
+      <w:start w:val="1"/>
+      <w:numFmt w:val="bullet"/>
+      <w:lvlText w:val=""/>
+      <w:lvlJc w:val="left"/>
+      <w:pPr>
+        <w:ind w:left="2880" w:hanging="360"/>
+      </w:pPr>
+      <w:rPr>
+        <w:rFonts w:ascii="Symbol" w:hAnsi="Symbol" w:hint="default"/>
+      </w:rPr>
+    </w:lvl>
+    <w:lvl w:ilvl="4" w:tplc="08090003" w:tentative="1">
+      <w:start w:val="1"/>
+      <w:numFmt w:val="bullet"/>
+      <w:lvlText w:val="o"/>
+      <w:lvlJc w:val="left"/>
+      <w:pPr>
+        <w:ind w:left="3600" w:hanging="360"/>
+      </w:pPr>
+      <w:rPr>
+        <w:rFonts w:ascii="Courier New" w:hAnsi="Courier New" w:cs="Courier New" w:hint="default"/>
+      </w:rPr>
+    </w:lvl>
+    <w:lvl w:ilvl="5" w:tplc="08090005" w:tentative="1">
+      <w:start w:val="1"/>
+      <w:numFmt w:val="bullet"/>
+      <w:lvlText w:val=""/>
+      <w:lvlJc w:val="left"/>
+      <w:pPr>
+        <w:ind w:left="4320" w:hanging="360"/>
+      </w:pPr>
+      <w:rPr>
+        <w:rFonts w:ascii="Wingdings" w:hAnsi="Wingdings" w:hint="default"/>
+      </w:rPr>
+    </w:lvl>
+    <w:lvl w:ilvl="6" w:tplc="08090001" w:tentative="1">
+      <w:start w:val="1"/>
+      <w:numFmt w:val="bullet"/>
+      <w:lvlText w:val=""/>
+      <w:lvlJc w:val="left"/>
+      <w:pPr>
+        <w:ind w:left="5040" w:hanging="360"/>
+      </w:pPr>
+      <w:rPr>
+        <w:rFonts w:ascii="Symbol" w:hAnsi="Symbol" w:hint="default"/>
+      </w:rPr>
+    </w:lvl>
+    <w:lvl w:ilvl="7" w:tplc="08090003" w:tentative="1">
+      <w:start w:val="1"/>
+      <w:numFmt w:val="bullet"/>
+      <w:lvlText w:val="o"/>
+      <w:lvlJc w:val="left"/>
+      <w:pPr>
+        <w:ind w:left="5760" w:hanging="360"/>
+      </w:pPr>
+      <w:rPr>
+        <w:rFonts w:ascii="Courier New" w:hAnsi="Courier New" w:cs="Courier New" w:hint="default"/>
+      </w:rPr>
+    </w:lvl>
+    <w:lvl w:ilvl="8" w:tplc="08090005" w:tentative="1">
+      <w:start w:val="1"/>
+      <w:numFmt w:val="bullet"/>
+      <w:lvlText w:val=""/>
+      <w:lvlJc w:val="left"/>
+      <w:pPr>
+        <w:ind w:left="6480" w:hanging="360"/>
+      </w:pPr>
+      <w:rPr>
+        <w:rFonts w:ascii="Wingdings" w:hAnsi="Wingdings" w:hint="default"/>
+      </w:rPr>
+    </w:lvl>
+  </w:abstractNum>
+  <w:abstractNum w:abstractNumId="5" w15:restartNumberingAfterBreak="0">
     <w:nsid w:val="2E6B0641"/>
     <w:multiLevelType w:val="hybridMultilevel"/>
     <w:tmpl w:val="3E941E58"/>
@@ -2252,7 +3030,346 @@
       </w:rPr>
     </w:lvl>
   </w:abstractNum>
-  <w:abstractNum w:abstractNumId="4" w15:restartNumberingAfterBreak="0">
+  <w:abstractNum w:abstractNumId="6" w15:restartNumberingAfterBreak="0">
+    <w:nsid w:val="32FC3B19"/>
+    <w:multiLevelType w:val="hybridMultilevel"/>
+    <w:tmpl w:val="BBF2BFE8"/>
+    <w:lvl w:ilvl="0" w:tplc="08090001">
+      <w:start w:val="1"/>
+      <w:numFmt w:val="bullet"/>
+      <w:lvlText w:val=""/>
+      <w:lvlJc w:val="left"/>
+      <w:pPr>
+        <w:ind w:left="720" w:hanging="360"/>
+      </w:pPr>
+      <w:rPr>
+        <w:rFonts w:ascii="Symbol" w:hAnsi="Symbol" w:hint="default"/>
+      </w:rPr>
+    </w:lvl>
+    <w:lvl w:ilvl="1" w:tplc="08090003" w:tentative="1">
+      <w:start w:val="1"/>
+      <w:numFmt w:val="bullet"/>
+      <w:lvlText w:val="o"/>
+      <w:lvlJc w:val="left"/>
+      <w:pPr>
+        <w:ind w:left="1440" w:hanging="360"/>
+      </w:pPr>
+      <w:rPr>
+        <w:rFonts w:ascii="Courier New" w:hAnsi="Courier New" w:cs="Courier New" w:hint="default"/>
+      </w:rPr>
+    </w:lvl>
+    <w:lvl w:ilvl="2" w:tplc="08090005" w:tentative="1">
+      <w:start w:val="1"/>
+      <w:numFmt w:val="bullet"/>
+      <w:lvlText w:val=""/>
+      <w:lvlJc w:val="left"/>
+      <w:pPr>
+        <w:ind w:left="2160" w:hanging="360"/>
+      </w:pPr>
+      <w:rPr>
+        <w:rFonts w:ascii="Wingdings" w:hAnsi="Wingdings" w:hint="default"/>
+      </w:rPr>
+    </w:lvl>
+    <w:lvl w:ilvl="3" w:tplc="08090001" w:tentative="1">
+      <w:start w:val="1"/>
+      <w:numFmt w:val="bullet"/>
+      <w:lvlText w:val=""/>
+      <w:lvlJc w:val="left"/>
+      <w:pPr>
+        <w:ind w:left="2880" w:hanging="360"/>
+      </w:pPr>
+      <w:rPr>
+        <w:rFonts w:ascii="Symbol" w:hAnsi="Symbol" w:hint="default"/>
+      </w:rPr>
+    </w:lvl>
+    <w:lvl w:ilvl="4" w:tplc="08090003" w:tentative="1">
+      <w:start w:val="1"/>
+      <w:numFmt w:val="bullet"/>
+      <w:lvlText w:val="o"/>
+      <w:lvlJc w:val="left"/>
+      <w:pPr>
+        <w:ind w:left="3600" w:hanging="360"/>
+      </w:pPr>
+      <w:rPr>
+        <w:rFonts w:ascii="Courier New" w:hAnsi="Courier New" w:cs="Courier New" w:hint="default"/>
+      </w:rPr>
+    </w:lvl>
+    <w:lvl w:ilvl="5" w:tplc="08090005" w:tentative="1">
+      <w:start w:val="1"/>
+      <w:numFmt w:val="bullet"/>
+      <w:lvlText w:val=""/>
+      <w:lvlJc w:val="left"/>
+      <w:pPr>
+        <w:ind w:left="4320" w:hanging="360"/>
+      </w:pPr>
+      <w:rPr>
+        <w:rFonts w:ascii="Wingdings" w:hAnsi="Wingdings" w:hint="default"/>
+      </w:rPr>
+    </w:lvl>
+    <w:lvl w:ilvl="6" w:tplc="08090001" w:tentative="1">
+      <w:start w:val="1"/>
+      <w:numFmt w:val="bullet"/>
+      <w:lvlText w:val=""/>
+      <w:lvlJc w:val="left"/>
+      <w:pPr>
+        <w:ind w:left="5040" w:hanging="360"/>
+      </w:pPr>
+      <w:rPr>
+        <w:rFonts w:ascii="Symbol" w:hAnsi="Symbol" w:hint="default"/>
+      </w:rPr>
+    </w:lvl>
+    <w:lvl w:ilvl="7" w:tplc="08090003" w:tentative="1">
+      <w:start w:val="1"/>
+      <w:numFmt w:val="bullet"/>
+      <w:lvlText w:val="o"/>
+      <w:lvlJc w:val="left"/>
+      <w:pPr>
+        <w:ind w:left="5760" w:hanging="360"/>
+      </w:pPr>
+      <w:rPr>
+        <w:rFonts w:ascii="Courier New" w:hAnsi="Courier New" w:cs="Courier New" w:hint="default"/>
+      </w:rPr>
+    </w:lvl>
+    <w:lvl w:ilvl="8" w:tplc="08090005" w:tentative="1">
+      <w:start w:val="1"/>
+      <w:numFmt w:val="bullet"/>
+      <w:lvlText w:val=""/>
+      <w:lvlJc w:val="left"/>
+      <w:pPr>
+        <w:ind w:left="6480" w:hanging="360"/>
+      </w:pPr>
+      <w:rPr>
+        <w:rFonts w:ascii="Wingdings" w:hAnsi="Wingdings" w:hint="default"/>
+      </w:rPr>
+    </w:lvl>
+  </w:abstractNum>
+  <w:abstractNum w:abstractNumId="7" w15:restartNumberingAfterBreak="0">
+    <w:nsid w:val="38C767C6"/>
+    <w:multiLevelType w:val="hybridMultilevel"/>
+    <w:tmpl w:val="E488EC50"/>
+    <w:lvl w:ilvl="0" w:tplc="08090001">
+      <w:start w:val="1"/>
+      <w:numFmt w:val="bullet"/>
+      <w:lvlText w:val=""/>
+      <w:lvlJc w:val="left"/>
+      <w:pPr>
+        <w:ind w:left="720" w:hanging="360"/>
+      </w:pPr>
+      <w:rPr>
+        <w:rFonts w:ascii="Symbol" w:hAnsi="Symbol" w:hint="default"/>
+      </w:rPr>
+    </w:lvl>
+    <w:lvl w:ilvl="1" w:tplc="08090003" w:tentative="1">
+      <w:start w:val="1"/>
+      <w:numFmt w:val="bullet"/>
+      <w:lvlText w:val="o"/>
+      <w:lvlJc w:val="left"/>
+      <w:pPr>
+        <w:ind w:left="1440" w:hanging="360"/>
+      </w:pPr>
+      <w:rPr>
+        <w:rFonts w:ascii="Courier New" w:hAnsi="Courier New" w:cs="Courier New" w:hint="default"/>
+      </w:rPr>
+    </w:lvl>
+    <w:lvl w:ilvl="2" w:tplc="08090005" w:tentative="1">
+      <w:start w:val="1"/>
+      <w:numFmt w:val="bullet"/>
+      <w:lvlText w:val=""/>
+      <w:lvlJc w:val="left"/>
+      <w:pPr>
+        <w:ind w:left="2160" w:hanging="360"/>
+      </w:pPr>
+      <w:rPr>
+        <w:rFonts w:ascii="Wingdings" w:hAnsi="Wingdings" w:hint="default"/>
+      </w:rPr>
+    </w:lvl>
+    <w:lvl w:ilvl="3" w:tplc="08090001" w:tentative="1">
+      <w:start w:val="1"/>
+      <w:numFmt w:val="bullet"/>
+      <w:lvlText w:val=""/>
+      <w:lvlJc w:val="left"/>
+      <w:pPr>
+        <w:ind w:left="2880" w:hanging="360"/>
+      </w:pPr>
+      <w:rPr>
+        <w:rFonts w:ascii="Symbol" w:hAnsi="Symbol" w:hint="default"/>
+      </w:rPr>
+    </w:lvl>
+    <w:lvl w:ilvl="4" w:tplc="08090003" w:tentative="1">
+      <w:start w:val="1"/>
+      <w:numFmt w:val="bullet"/>
+      <w:lvlText w:val="o"/>
+      <w:lvlJc w:val="left"/>
+      <w:pPr>
+        <w:ind w:left="3600" w:hanging="360"/>
+      </w:pPr>
+      <w:rPr>
+        <w:rFonts w:ascii="Courier New" w:hAnsi="Courier New" w:cs="Courier New" w:hint="default"/>
+      </w:rPr>
+    </w:lvl>
+    <w:lvl w:ilvl="5" w:tplc="08090005" w:tentative="1">
+      <w:start w:val="1"/>
+      <w:numFmt w:val="bullet"/>
+      <w:lvlText w:val=""/>
+      <w:lvlJc w:val="left"/>
+      <w:pPr>
+        <w:ind w:left="4320" w:hanging="360"/>
+      </w:pPr>
+      <w:rPr>
+        <w:rFonts w:ascii="Wingdings" w:hAnsi="Wingdings" w:hint="default"/>
+      </w:rPr>
+    </w:lvl>
+    <w:lvl w:ilvl="6" w:tplc="08090001" w:tentative="1">
+      <w:start w:val="1"/>
+      <w:numFmt w:val="bullet"/>
+      <w:lvlText w:val=""/>
+      <w:lvlJc w:val="left"/>
+      <w:pPr>
+        <w:ind w:left="5040" w:hanging="360"/>
+      </w:pPr>
+      <w:rPr>
+        <w:rFonts w:ascii="Symbol" w:hAnsi="Symbol" w:hint="default"/>
+      </w:rPr>
+    </w:lvl>
+    <w:lvl w:ilvl="7" w:tplc="08090003" w:tentative="1">
+      <w:start w:val="1"/>
+      <w:numFmt w:val="bullet"/>
+      <w:lvlText w:val="o"/>
+      <w:lvlJc w:val="left"/>
+      <w:pPr>
+        <w:ind w:left="5760" w:hanging="360"/>
+      </w:pPr>
+      <w:rPr>
+        <w:rFonts w:ascii="Courier New" w:hAnsi="Courier New" w:cs="Courier New" w:hint="default"/>
+      </w:rPr>
+    </w:lvl>
+    <w:lvl w:ilvl="8" w:tplc="08090005" w:tentative="1">
+      <w:start w:val="1"/>
+      <w:numFmt w:val="bullet"/>
+      <w:lvlText w:val=""/>
+      <w:lvlJc w:val="left"/>
+      <w:pPr>
+        <w:ind w:left="6480" w:hanging="360"/>
+      </w:pPr>
+      <w:rPr>
+        <w:rFonts w:ascii="Wingdings" w:hAnsi="Wingdings" w:hint="default"/>
+      </w:rPr>
+    </w:lvl>
+  </w:abstractNum>
+  <w:abstractNum w:abstractNumId="8" w15:restartNumberingAfterBreak="0">
+    <w:nsid w:val="47B51C5D"/>
+    <w:multiLevelType w:val="hybridMultilevel"/>
+    <w:tmpl w:val="C4906102"/>
+    <w:lvl w:ilvl="0" w:tplc="08090001">
+      <w:start w:val="1"/>
+      <w:numFmt w:val="bullet"/>
+      <w:lvlText w:val=""/>
+      <w:lvlJc w:val="left"/>
+      <w:pPr>
+        <w:ind w:left="720" w:hanging="360"/>
+      </w:pPr>
+      <w:rPr>
+        <w:rFonts w:ascii="Symbol" w:hAnsi="Symbol" w:hint="default"/>
+      </w:rPr>
+    </w:lvl>
+    <w:lvl w:ilvl="1" w:tplc="08090003" w:tentative="1">
+      <w:start w:val="1"/>
+      <w:numFmt w:val="bullet"/>
+      <w:lvlText w:val="o"/>
+      <w:lvlJc w:val="left"/>
+      <w:pPr>
+        <w:ind w:left="1440" w:hanging="360"/>
+      </w:pPr>
+      <w:rPr>
+        <w:rFonts w:ascii="Courier New" w:hAnsi="Courier New" w:cs="Courier New" w:hint="default"/>
+      </w:rPr>
+    </w:lvl>
+    <w:lvl w:ilvl="2" w:tplc="08090005" w:tentative="1">
+      <w:start w:val="1"/>
+      <w:numFmt w:val="bullet"/>
+      <w:lvlText w:val=""/>
+      <w:lvlJc w:val="left"/>
+      <w:pPr>
+        <w:ind w:left="2160" w:hanging="360"/>
+      </w:pPr>
+      <w:rPr>
+        <w:rFonts w:ascii="Wingdings" w:hAnsi="Wingdings" w:hint="default"/>
+      </w:rPr>
+    </w:lvl>
+    <w:lvl w:ilvl="3" w:tplc="08090001" w:tentative="1">
+      <w:start w:val="1"/>
+      <w:numFmt w:val="bullet"/>
+      <w:lvlText w:val=""/>
+      <w:lvlJc w:val="left"/>
+      <w:pPr>
+        <w:ind w:left="2880" w:hanging="360"/>
+      </w:pPr>
+      <w:rPr>
+        <w:rFonts w:ascii="Symbol" w:hAnsi="Symbol" w:hint="default"/>
+      </w:rPr>
+    </w:lvl>
+    <w:lvl w:ilvl="4" w:tplc="08090003" w:tentative="1">
+      <w:start w:val="1"/>
+      <w:numFmt w:val="bullet"/>
+      <w:lvlText w:val="o"/>
+      <w:lvlJc w:val="left"/>
+      <w:pPr>
+        <w:ind w:left="3600" w:hanging="360"/>
+      </w:pPr>
+      <w:rPr>
+        <w:rFonts w:ascii="Courier New" w:hAnsi="Courier New" w:cs="Courier New" w:hint="default"/>
+      </w:rPr>
+    </w:lvl>
+    <w:lvl w:ilvl="5" w:tplc="08090005" w:tentative="1">
+      <w:start w:val="1"/>
+      <w:numFmt w:val="bullet"/>
+      <w:lvlText w:val=""/>
+      <w:lvlJc w:val="left"/>
+      <w:pPr>
+        <w:ind w:left="4320" w:hanging="360"/>
+      </w:pPr>
+      <w:rPr>
+        <w:rFonts w:ascii="Wingdings" w:hAnsi="Wingdings" w:hint="default"/>
+      </w:rPr>
+    </w:lvl>
+    <w:lvl w:ilvl="6" w:tplc="08090001" w:tentative="1">
+      <w:start w:val="1"/>
+      <w:numFmt w:val="bullet"/>
+      <w:lvlText w:val=""/>
+      <w:lvlJc w:val="left"/>
+      <w:pPr>
+        <w:ind w:left="5040" w:hanging="360"/>
+      </w:pPr>
+      <w:rPr>
+        <w:rFonts w:ascii="Symbol" w:hAnsi="Symbol" w:hint="default"/>
+      </w:rPr>
+    </w:lvl>
+    <w:lvl w:ilvl="7" w:tplc="08090003" w:tentative="1">
+      <w:start w:val="1"/>
+      <w:numFmt w:val="bullet"/>
+      <w:lvlText w:val="o"/>
+      <w:lvlJc w:val="left"/>
+      <w:pPr>
+        <w:ind w:left="5760" w:hanging="360"/>
+      </w:pPr>
+      <w:rPr>
+        <w:rFonts w:ascii="Courier New" w:hAnsi="Courier New" w:cs="Courier New" w:hint="default"/>
+      </w:rPr>
+    </w:lvl>
+    <w:lvl w:ilvl="8" w:tplc="08090005" w:tentative="1">
+      <w:start w:val="1"/>
+      <w:numFmt w:val="bullet"/>
+      <w:lvlText w:val=""/>
+      <w:lvlJc w:val="left"/>
+      <w:pPr>
+        <w:ind w:left="6480" w:hanging="360"/>
+      </w:pPr>
+      <w:rPr>
+        <w:rFonts w:ascii="Wingdings" w:hAnsi="Wingdings" w:hint="default"/>
+      </w:rPr>
+    </w:lvl>
+  </w:abstractNum>
+  <w:abstractNum w:abstractNumId="9" w15:restartNumberingAfterBreak="0">
     <w:nsid w:val="6B97536B"/>
     <w:multiLevelType w:val="hybridMultilevel"/>
     <w:tmpl w:val="FB52194E"/>
@@ -2365,7 +3482,120 @@
       </w:rPr>
     </w:lvl>
   </w:abstractNum>
-  <w:abstractNum w:abstractNumId="5" w15:restartNumberingAfterBreak="0">
+  <w:abstractNum w:abstractNumId="10" w15:restartNumberingAfterBreak="0">
+    <w:nsid w:val="6DCB4E9F"/>
+    <w:multiLevelType w:val="hybridMultilevel"/>
+    <w:tmpl w:val="194A8318"/>
+    <w:lvl w:ilvl="0" w:tplc="08090001">
+      <w:start w:val="1"/>
+      <w:numFmt w:val="bullet"/>
+      <w:lvlText w:val=""/>
+      <w:lvlJc w:val="left"/>
+      <w:pPr>
+        <w:ind w:left="720" w:hanging="360"/>
+      </w:pPr>
+      <w:rPr>
+        <w:rFonts w:ascii="Symbol" w:hAnsi="Symbol" w:hint="default"/>
+      </w:rPr>
+    </w:lvl>
+    <w:lvl w:ilvl="1" w:tplc="08090003" w:tentative="1">
+      <w:start w:val="1"/>
+      <w:numFmt w:val="bullet"/>
+      <w:lvlText w:val="o"/>
+      <w:lvlJc w:val="left"/>
+      <w:pPr>
+        <w:ind w:left="1440" w:hanging="360"/>
+      </w:pPr>
+      <w:rPr>
+        <w:rFonts w:ascii="Courier New" w:hAnsi="Courier New" w:cs="Courier New" w:hint="default"/>
+      </w:rPr>
+    </w:lvl>
+    <w:lvl w:ilvl="2" w:tplc="08090005" w:tentative="1">
+      <w:start w:val="1"/>
+      <w:numFmt w:val="bullet"/>
+      <w:lvlText w:val=""/>
+      <w:lvlJc w:val="left"/>
+      <w:pPr>
+        <w:ind w:left="2160" w:hanging="360"/>
+      </w:pPr>
+      <w:rPr>
+        <w:rFonts w:ascii="Wingdings" w:hAnsi="Wingdings" w:hint="default"/>
+      </w:rPr>
+    </w:lvl>
+    <w:lvl w:ilvl="3" w:tplc="08090001" w:tentative="1">
+      <w:start w:val="1"/>
+      <w:numFmt w:val="bullet"/>
+      <w:lvlText w:val=""/>
+      <w:lvlJc w:val="left"/>
+      <w:pPr>
+        <w:ind w:left="2880" w:hanging="360"/>
+      </w:pPr>
+      <w:rPr>
+        <w:rFonts w:ascii="Symbol" w:hAnsi="Symbol" w:hint="default"/>
+      </w:rPr>
+    </w:lvl>
+    <w:lvl w:ilvl="4" w:tplc="08090003" w:tentative="1">
+      <w:start w:val="1"/>
+      <w:numFmt w:val="bullet"/>
+      <w:lvlText w:val="o"/>
+      <w:lvlJc w:val="left"/>
+      <w:pPr>
+        <w:ind w:left="3600" w:hanging="360"/>
+      </w:pPr>
+      <w:rPr>
+        <w:rFonts w:ascii="Courier New" w:hAnsi="Courier New" w:cs="Courier New" w:hint="default"/>
+      </w:rPr>
+    </w:lvl>
+    <w:lvl w:ilvl="5" w:tplc="08090005" w:tentative="1">
+      <w:start w:val="1"/>
+      <w:numFmt w:val="bullet"/>
+      <w:lvlText w:val=""/>
+      <w:lvlJc w:val="left"/>
+      <w:pPr>
+        <w:ind w:left="4320" w:hanging="360"/>
+      </w:pPr>
+      <w:rPr>
+        <w:rFonts w:ascii="Wingdings" w:hAnsi="Wingdings" w:hint="default"/>
+      </w:rPr>
+    </w:lvl>
+    <w:lvl w:ilvl="6" w:tplc="08090001" w:tentative="1">
+      <w:start w:val="1"/>
+      <w:numFmt w:val="bullet"/>
+      <w:lvlText w:val=""/>
+      <w:lvlJc w:val="left"/>
+      <w:pPr>
+        <w:ind w:left="5040" w:hanging="360"/>
+      </w:pPr>
+      <w:rPr>
+        <w:rFonts w:ascii="Symbol" w:hAnsi="Symbol" w:hint="default"/>
+      </w:rPr>
+    </w:lvl>
+    <w:lvl w:ilvl="7" w:tplc="08090003" w:tentative="1">
+      <w:start w:val="1"/>
+      <w:numFmt w:val="bullet"/>
+      <w:lvlText w:val="o"/>
+      <w:lvlJc w:val="left"/>
+      <w:pPr>
+        <w:ind w:left="5760" w:hanging="360"/>
+      </w:pPr>
+      <w:rPr>
+        <w:rFonts w:ascii="Courier New" w:hAnsi="Courier New" w:cs="Courier New" w:hint="default"/>
+      </w:rPr>
+    </w:lvl>
+    <w:lvl w:ilvl="8" w:tplc="08090005" w:tentative="1">
+      <w:start w:val="1"/>
+      <w:numFmt w:val="bullet"/>
+      <w:lvlText w:val=""/>
+      <w:lvlJc w:val="left"/>
+      <w:pPr>
+        <w:ind w:left="6480" w:hanging="360"/>
+      </w:pPr>
+      <w:rPr>
+        <w:rFonts w:ascii="Wingdings" w:hAnsi="Wingdings" w:hint="default"/>
+      </w:rPr>
+    </w:lvl>
+  </w:abstractNum>
+  <w:abstractNum w:abstractNumId="11" w15:restartNumberingAfterBreak="0">
     <w:nsid w:val="714E13DF"/>
     <w:multiLevelType w:val="hybridMultilevel"/>
     <w:tmpl w:val="15A0E000"/>
@@ -2482,19 +3712,37 @@
     <w:abstractNumId w:val="0"/>
   </w:num>
   <w:num w:numId="2" w16cid:durableId="912472578">
+    <w:abstractNumId w:val="2"/>
+  </w:num>
+  <w:num w:numId="3" w16cid:durableId="2079862219">
+    <w:abstractNumId w:val="11"/>
+  </w:num>
+  <w:num w:numId="4" w16cid:durableId="495347069">
+    <w:abstractNumId w:val="5"/>
+  </w:num>
+  <w:num w:numId="5" w16cid:durableId="1330447720">
+    <w:abstractNumId w:val="3"/>
+  </w:num>
+  <w:num w:numId="6" w16cid:durableId="423958798">
+    <w:abstractNumId w:val="9"/>
+  </w:num>
+  <w:num w:numId="7" w16cid:durableId="1994137893">
+    <w:abstractNumId w:val="6"/>
+  </w:num>
+  <w:num w:numId="8" w16cid:durableId="956451544">
     <w:abstractNumId w:val="1"/>
   </w:num>
-  <w:num w:numId="3" w16cid:durableId="2079862219">
-    <w:abstractNumId w:val="5"/>
+  <w:num w:numId="9" w16cid:durableId="1067997821">
+    <w:abstractNumId w:val="8"/>
   </w:num>
-  <w:num w:numId="4" w16cid:durableId="495347069">
-    <w:abstractNumId w:val="3"/>
+  <w:num w:numId="10" w16cid:durableId="405811620">
+    <w:abstractNumId w:val="4"/>
   </w:num>
-  <w:num w:numId="5" w16cid:durableId="1330447720">
-    <w:abstractNumId w:val="2"/>
+  <w:num w:numId="11" w16cid:durableId="1645044471">
+    <w:abstractNumId w:val="10"/>
   </w:num>
-  <w:num w:numId="6" w16cid:durableId="423958798">
-    <w:abstractNumId w:val="4"/>
+  <w:num w:numId="12" w16cid:durableId="1861121166">
+    <w:abstractNumId w:val="7"/>
   </w:num>
 </w:numbering>
 </file>
@@ -3459,6 +4707,17 @@
       <w:spacing w:after="0" w:line="240" w:lineRule="auto"/>
     </w:pPr>
   </w:style>
+  <w:style w:type="character" w:styleId="Strong">
+    <w:name w:val="Strong"/>
+    <w:basedOn w:val="DefaultParagraphFont"/>
+    <w:uiPriority w:val="22"/>
+    <w:qFormat/>
+    <w:rsid w:val="00541546"/>
+    <w:rPr>
+      <w:b/>
+      <w:bCs/>
+    </w:rPr>
+  </w:style>
 </w:styles>
 </file>
 

</xml_diff>